<commit_message>
fix: medium review findings; StatusPulse pages match the app; claims tightened
- /statuspulse, /privacy, /terms rewritten from dwell docs (all scopes, both endpoints, weekly
  personal-data report); /dwell and /dwell/privacy 308 to /statuspulse
- honest claims: EduScale matchmaking numbers from DevScale main, DevTrack rule-based, BALLAST
  29 findings (18 in the checking apparatus), Lighthouse gating wording, no 'horizontally scaled'
- a11y: achievement cards are real links, blog tag filters are pressed-state buttons
- heatmap month labels computed from data; route-dates script refuses shallow clones
- resume DOCX rebuilt; its test now reads the compiled document
Gate: tsc 0, eslint 0, prettier clean, jest 591/591, next build ok; claim check 24 match.
</commit_message>
<xml_diff>
--- a/resume/Shailesh_Chaudhari_Resume.docx
+++ b/resume/Shailesh_Chaudhari_Resume.docx
@@ -58,7 +58,7 @@
         <w:t>Software Engineer, ContextQA</w:t>
       </w:r>
       <w:r>
-        <w:t xml:space="preserve">  (Jul 2025 - Present)</w:t>
+        <w:t xml:space="preserve">  (Aug 2025 - Present)</w:t>
       </w:r>
     </w:p>
     <w:p>
@@ -210,7 +210,7 @@
         <w:pStyle w:val="ListBullet"/>
       </w:pPr>
       <w:r>
-        <w:t>Verified 4 independent ways: 8 invariants, a reference oracle, mutation testing (158 of 165 mutants killed, 209 tests), and a self-verifying shrinker. Found 9 real bugs, 4 of them in the checker rather than the implementation.</w:t>
+        <w:t>Verified 4 independent ways: 8 invariants, a reference oracle, mutation testing (352 of 362 mutants killed, 291 tests), and a self-verifying shrinker. Found 29 real bugs, 18 of them in the checker rather than the implementation.</w:t>
       </w:r>
     </w:p>
     <w:p>

</xml_diff>